<commit_message>
fixed a Step 2 de-duplication issue
</commit_message>
<xml_diff>
--- a/docs/Step3_Integration_Update.docx
+++ b/docs/Step3_Integration_Update.docx
@@ -398,7 +398,7 @@
                 <w:color w:val="17324D"/>
                 <w:sz w:val="36"/>
               </w:rPr>
-              <w:t>239</w:t>
+              <w:t>296</w:t>
               <w:br/>
             </w:r>
             <w:r>
@@ -1355,7 +1355,7 @@
                 <w:b w:val="0"/>
                 <w:sz w:val="19"/>
               </w:rPr>
-              <w:t>78</w:t>
+              <w:t>85</w:t>
             </w:r>
           </w:p>
         </w:tc>
@@ -1395,7 +1395,7 @@
                 <w:b w:val="0"/>
                 <w:sz w:val="19"/>
               </w:rPr>
-              <w:t>66 unsupported buffer-bound predicates; 12 intentional validators</w:t>
+              <w:t>66 unsupported buffer-bound predicates; 19 intentional validators</w:t>
             </w:r>
           </w:p>
         </w:tc>
@@ -1601,7 +1601,7 @@
                 <w:b w:val="0"/>
                 <w:sz w:val="19"/>
               </w:rPr>
-              <w:t>143</w:t>
+              <w:t>192</w:t>
             </w:r>
           </w:p>
         </w:tc>
@@ -1641,7 +1641,7 @@
                 <w:b w:val="0"/>
                 <w:sz w:val="19"/>
               </w:rPr>
-              <w:t>143 intentional validators, no generated patches</w:t>
+              <w:t>192 intentional validators, no generated patches</w:t>
             </w:r>
           </w:p>
         </w:tc>
@@ -1847,7 +1847,7 @@
                 <w:b w:val="0"/>
                 <w:sz w:val="19"/>
               </w:rPr>
-              <w:t>3</w:t>
+              <w:t>4</w:t>
             </w:r>
           </w:p>
         </w:tc>
@@ -1887,7 +1887,7 @@
                 <w:b w:val="0"/>
                 <w:sz w:val="19"/>
               </w:rPr>
-              <w:t>3 auto-patchable exception guards</w:t>
+              <w:t>4 auto-patchable events collapsed into 3 patch files</w:t>
             </w:r>
           </w:p>
         </w:tc>
@@ -2642,7 +2642,7 @@
     </w:p>
     <w:p>
       <w:r>
-        <w:t>The first patch set was too optimistic. Step 3 was generating patches for events that were not real repair targets. We found five main sources of false positives and fixed them before regenerating the final benchmark:</w:t>
+        <w:t>The first patch set was too optimistic. Step 3 was generating patches for events that were not real repair targets. We found five main sources of false positives, plus one missed-exception bug in Step 2's de-duplication, and fixed them before regenerating the final benchmark:</w:t>
       </w:r>
     </w:p>
     <w:tbl>
@@ -3205,11 +3205,118 @@
           </w:p>
         </w:tc>
       </w:tr>
+      <w:tr>
+        <w:tc>
+          <w:tcPr>
+            <w:tcW w:type="dxa" w:w="3360"/>
+          </w:tcPr>
+          <w:p>
+            <w:r>
+              <w:rPr>
+                <w:b w:val="0"/>
+                <w:sz w:val="19"/>
+              </w:rPr>
+            </w:r>
+            <w:r>
+              <w:rPr>
+                <w:b w:val="0"/>
+                <w:sz w:val="19"/>
+              </w:rPr>
+              <w:t>Different exception types from the same instrumentation log site shared the same ID</w:t>
+            </w:r>
+          </w:p>
+        </w:tc>
+        <w:tc>
+          <w:tcPr>
+            <w:tcW w:type="dxa" w:w="3360"/>
+          </w:tcPr>
+          <w:p>
+            <w:r>
+              <w:rPr>
+                <w:b w:val="0"/>
+                <w:sz w:val="19"/>
+              </w:rPr>
+            </w:r>
+            <w:r>
+              <w:rPr>
+                <w:b w:val="0"/>
+                <w:sz w:val="19"/>
+              </w:rPr>
+              <w:t>A real crash could be hidden if a validator exception had already used that log-site ID</w:t>
+            </w:r>
+          </w:p>
+        </w:tc>
+        <w:tc>
+          <w:tcPr>
+            <w:tcW w:type="dxa" w:w="3360"/>
+          </w:tcPr>
+          <w:p>
+            <w:r>
+              <w:rPr>
+                <w:b w:val="0"/>
+                <w:sz w:val="19"/>
+              </w:rPr>
+            </w:r>
+            <w:r>
+              <w:rPr>
+                <w:b w:val="0"/>
+                <w:sz w:val="19"/>
+              </w:rPr>
+              <w:t xml:space="preserve">Step 2 </w:t>
+            </w:r>
+            <w:r>
+              <w:rPr>
+                <w:rFonts w:ascii="Consolas" w:hAnsi="Consolas"/>
+                <w:b w:val="0"/>
+                <w:sz w:val="19"/>
+              </w:rPr>
+              <w:t>ExceptionRule</w:t>
+            </w:r>
+            <w:r>
+              <w:rPr>
+                <w:b w:val="0"/>
+                <w:sz w:val="19"/>
+              </w:rPr>
+              <w:t xml:space="preserve"> now de-duplicates by </w:t>
+            </w:r>
+            <w:r>
+              <w:rPr>
+                <w:rFonts w:ascii="Consolas" w:hAnsi="Consolas"/>
+                <w:b w:val="0"/>
+                <w:sz w:val="19"/>
+              </w:rPr>
+              <w:t>traceId + exception type</w:t>
+            </w:r>
+            <w:r>
+              <w:rPr>
+                <w:b w:val="0"/>
+                <w:sz w:val="19"/>
+              </w:rPr>
+              <w:t xml:space="preserve">, not </w:t>
+            </w:r>
+            <w:r>
+              <w:rPr>
+                <w:rFonts w:ascii="Consolas" w:hAnsi="Consolas"/>
+                <w:b w:val="0"/>
+                <w:sz w:val="19"/>
+              </w:rPr>
+              <w:t>traceId</w:t>
+            </w:r>
+            <w:r>
+              <w:rPr>
+                <w:b w:val="0"/>
+                <w:sz w:val="19"/>
+              </w:rPr>
+              <w:t xml:space="preserve"> alone</w:t>
+            </w:r>
+          </w:p>
+        </w:tc>
+      </w:tr>
     </w:tbl>
     <w:p/>
     <w:p>
       <w:r>
-        <w:t xml:space="preserve">These fixes changed the final corpus from the earlier 240 violations / 7 patches snapshot to 239 violations / 6 patches. The removed patch was the Deque </w:t>
+        <w:t xml:space="preserve">After these fixes, the final refreshed corpus is 296 violations / 6 generated patch files. The patch count stayed at 6 after the de-duplication fix; the extra violations are distinct exception types that were previously collapsed at the same instrumentation log site. The removed Deque </w:t>
       </w:r>
       <w:r>
         <w:rPr>
@@ -3219,7 +3326,7 @@
         <w:t>RankException</w:t>
       </w:r>
       <w:r>
-        <w:t xml:space="preserve"> case, because the public </w:t>
+        <w:t xml:space="preserve"> patch remains removed, because the public </w:t>
       </w:r>
       <w:r>
         <w:rPr>
@@ -3730,6 +3837,815 @@
       </w:r>
       <w:r>
         <w:t xml:space="preserve"> are two separate candidate repairs for two separate trace observations, not one combined production patch.</w:t>
+      </w:r>
+    </w:p>
+    <w:p>
+      <w:pPr>
+        <w:pStyle w:val="Heading1"/>
+      </w:pPr>
+      <w:r>
+        <w:t>Fresh unseen repo validation</w:t>
+      </w:r>
+    </w:p>
+    <w:p>
+      <w:r>
+        <w:t xml:space="preserve">To check whether the current pipeline works outside the 13-repository benchmark, we created a new local validation repository that was not part of the scan corpus: </w:t>
+      </w:r>
+      <w:r>
+        <w:rPr>
+          <w:rFonts w:ascii="Consolas" w:hAnsi="Consolas"/>
+          <w:sz w:val="18"/>
+        </w:rPr>
+        <w:t>AutoRepair/fresh_validation_workspace/ScoreParserValidation</w:t>
+      </w:r>
+      <w:r>
+        <w:t>.</w:t>
+      </w:r>
+    </w:p>
+    <w:p>
+      <w:r>
+        <w:t>The repo has two deliberate paths in the same method:</w:t>
+      </w:r>
+    </w:p>
+    <w:tbl>
+      <w:tblPr>
+        <w:tblStyle w:val="TableGrid"/>
+        <w:tblW w:type="auto" w:w="0"/>
+        <w:tblLook w:firstColumn="1" w:firstRow="1" w:lastColumn="0" w:lastRow="0" w:noHBand="0" w:noVBand="1" w:val="04A0"/>
+      </w:tblPr>
+      <w:tblGrid>
+        <w:gridCol w:w="3360"/>
+        <w:gridCol w:w="3360"/>
+        <w:gridCol w:w="3360"/>
+      </w:tblGrid>
+      <w:tr>
+        <w:tc>
+          <w:tcPr>
+            <w:tcW w:type="dxa" w:w="3360"/>
+            <w:shd w:fill="E8F3FF"/>
+          </w:tcPr>
+          <w:p>
+            <w:r>
+              <w:rPr>
+                <w:b/>
+                <w:sz w:val="19"/>
+              </w:rPr>
+            </w:r>
+            <w:r>
+              <w:rPr>
+                <w:b/>
+                <w:sz w:val="19"/>
+              </w:rPr>
+              <w:t>Path</w:t>
+            </w:r>
+          </w:p>
+        </w:tc>
+        <w:tc>
+          <w:tcPr>
+            <w:tcW w:type="dxa" w:w="3360"/>
+            <w:shd w:fill="E8F3FF"/>
+          </w:tcPr>
+          <w:p>
+            <w:r>
+              <w:rPr>
+                <w:b/>
+                <w:sz w:val="19"/>
+              </w:rPr>
+            </w:r>
+            <w:r>
+              <w:rPr>
+                <w:b/>
+                <w:sz w:val="19"/>
+              </w:rPr>
+              <w:t>Expected behavior before repair</w:t>
+            </w:r>
+          </w:p>
+        </w:tc>
+        <w:tc>
+          <w:tcPr>
+            <w:tcW w:type="dxa" w:w="3360"/>
+            <w:shd w:fill="E8F3FF"/>
+          </w:tcPr>
+          <w:p>
+            <w:r>
+              <w:rPr>
+                <w:b/>
+                <w:sz w:val="19"/>
+              </w:rPr>
+            </w:r>
+            <w:r>
+              <w:rPr>
+                <w:b/>
+                <w:sz w:val="19"/>
+              </w:rPr>
+              <w:t>What AutoRepair should do</w:t>
+            </w:r>
+          </w:p>
+        </w:tc>
+      </w:tr>
+      <w:tr>
+        <w:tc>
+          <w:tcPr>
+            <w:tcW w:type="dxa" w:w="3360"/>
+          </w:tcPr>
+          <w:p>
+            <w:r>
+              <w:rPr>
+                <w:b w:val="0"/>
+                <w:sz w:val="19"/>
+              </w:rPr>
+            </w:r>
+            <w:r>
+              <w:rPr>
+                <w:rFonts w:ascii="Consolas" w:hAnsi="Consolas"/>
+                <w:b w:val="0"/>
+                <w:sz w:val="19"/>
+              </w:rPr>
+              <w:t>ParseScore("alice,not-a-number")</w:t>
+            </w:r>
+          </w:p>
+        </w:tc>
+        <w:tc>
+          <w:tcPr>
+            <w:tcW w:type="dxa" w:w="3360"/>
+          </w:tcPr>
+          <w:p>
+            <w:r>
+              <w:rPr>
+                <w:b w:val="0"/>
+                <w:sz w:val="19"/>
+              </w:rPr>
+            </w:r>
+            <w:r>
+              <w:rPr>
+                <w:b w:val="0"/>
+                <w:sz w:val="19"/>
+              </w:rPr>
+              <w:t xml:space="preserve">Throws </w:t>
+            </w:r>
+            <w:r>
+              <w:rPr>
+                <w:rFonts w:ascii="Consolas" w:hAnsi="Consolas"/>
+                <w:b w:val="0"/>
+                <w:sz w:val="19"/>
+              </w:rPr>
+              <w:t>System.FormatException</w:t>
+            </w:r>
+            <w:r>
+              <w:rPr>
+                <w:b w:val="0"/>
+                <w:sz w:val="19"/>
+              </w:rPr>
+              <w:t xml:space="preserve"> and fails </w:t>
+            </w:r>
+            <w:r>
+              <w:rPr>
+                <w:rFonts w:ascii="Consolas" w:hAnsi="Consolas"/>
+                <w:b w:val="0"/>
+                <w:sz w:val="19"/>
+              </w:rPr>
+              <w:t>MalformedScoreDoesNotCrash</w:t>
+            </w:r>
+          </w:p>
+        </w:tc>
+        <w:tc>
+          <w:tcPr>
+            <w:tcW w:type="dxa" w:w="3360"/>
+          </w:tcPr>
+          <w:p>
+            <w:r>
+              <w:rPr>
+                <w:b w:val="0"/>
+                <w:sz w:val="19"/>
+              </w:rPr>
+            </w:r>
+            <w:r>
+              <w:rPr>
+                <w:b w:val="0"/>
+                <w:sz w:val="19"/>
+              </w:rPr>
+              <w:t>Generate one patch candidate</w:t>
+            </w:r>
+          </w:p>
+        </w:tc>
+      </w:tr>
+      <w:tr>
+        <w:tc>
+          <w:tcPr>
+            <w:tcW w:type="dxa" w:w="3360"/>
+          </w:tcPr>
+          <w:p>
+            <w:r>
+              <w:rPr>
+                <w:b w:val="0"/>
+                <w:sz w:val="19"/>
+              </w:rPr>
+            </w:r>
+            <w:r>
+              <w:rPr>
+                <w:rFonts w:ascii="Consolas" w:hAnsi="Consolas"/>
+                <w:b w:val="0"/>
+                <w:sz w:val="19"/>
+              </w:rPr>
+              <w:t>ParseScore(null!)</w:t>
+            </w:r>
+          </w:p>
+        </w:tc>
+        <w:tc>
+          <w:tcPr>
+            <w:tcW w:type="dxa" w:w="3360"/>
+          </w:tcPr>
+          <w:p>
+            <w:r>
+              <w:rPr>
+                <w:b w:val="0"/>
+                <w:sz w:val="19"/>
+              </w:rPr>
+            </w:r>
+            <w:r>
+              <w:rPr>
+                <w:b w:val="0"/>
+                <w:sz w:val="19"/>
+              </w:rPr>
+              <w:t xml:space="preserve">Throws </w:t>
+            </w:r>
+            <w:r>
+              <w:rPr>
+                <w:rFonts w:ascii="Consolas" w:hAnsi="Consolas"/>
+                <w:b w:val="0"/>
+                <w:sz w:val="19"/>
+              </w:rPr>
+              <w:t>System.ArgumentNullException</w:t>
+            </w:r>
+            <w:r>
+              <w:rPr>
+                <w:b w:val="0"/>
+                <w:sz w:val="19"/>
+              </w:rPr>
+              <w:t xml:space="preserve"> by explicit validation and passes </w:t>
+            </w:r>
+            <w:r>
+              <w:rPr>
+                <w:rFonts w:ascii="Consolas" w:hAnsi="Consolas"/>
+                <w:b w:val="0"/>
+                <w:sz w:val="19"/>
+              </w:rPr>
+              <w:t>Assert.Throws</w:t>
+            </w:r>
+          </w:p>
+        </w:tc>
+        <w:tc>
+          <w:tcPr>
+            <w:tcW w:type="dxa" w:w="3360"/>
+          </w:tcPr>
+          <w:p>
+            <w:r>
+              <w:rPr>
+                <w:b w:val="0"/>
+                <w:sz w:val="19"/>
+              </w:rPr>
+            </w:r>
+            <w:r>
+              <w:rPr>
+                <w:b w:val="0"/>
+                <w:sz w:val="19"/>
+              </w:rPr>
+              <w:t xml:space="preserve">Skip as </w:t>
+            </w:r>
+            <w:r>
+              <w:rPr>
+                <w:rFonts w:ascii="Consolas" w:hAnsi="Consolas"/>
+                <w:b w:val="0"/>
+                <w:sz w:val="19"/>
+              </w:rPr>
+              <w:t>IntentionalValidator</w:t>
+            </w:r>
+          </w:p>
+        </w:tc>
+      </w:tr>
+    </w:tbl>
+    <w:p/>
+    <w:p>
+      <w:r>
+        <w:t>Fresh validation results:</w:t>
+      </w:r>
+    </w:p>
+    <w:tbl>
+      <w:tblPr>
+        <w:tblStyle w:val="TableGrid"/>
+        <w:tblW w:type="auto" w:w="0"/>
+        <w:tblLook w:firstColumn="1" w:firstRow="1" w:lastColumn="0" w:lastRow="0" w:noHBand="0" w:noVBand="1" w:val="04A0"/>
+      </w:tblPr>
+      <w:tblGrid>
+        <w:gridCol w:w="5040"/>
+        <w:gridCol w:w="5040"/>
+      </w:tblGrid>
+      <w:tr>
+        <w:tc>
+          <w:tcPr>
+            <w:tcW w:type="dxa" w:w="5040"/>
+            <w:shd w:fill="E8F3FF"/>
+          </w:tcPr>
+          <w:p>
+            <w:r>
+              <w:rPr>
+                <w:b/>
+                <w:sz w:val="19"/>
+              </w:rPr>
+            </w:r>
+            <w:r>
+              <w:rPr>
+                <w:b/>
+                <w:sz w:val="19"/>
+              </w:rPr>
+              <w:t>Check</w:t>
+            </w:r>
+          </w:p>
+        </w:tc>
+        <w:tc>
+          <w:tcPr>
+            <w:tcW w:type="dxa" w:w="5040"/>
+            <w:shd w:fill="E8F3FF"/>
+          </w:tcPr>
+          <w:p>
+            <w:r>
+              <w:rPr>
+                <w:b/>
+                <w:sz w:val="19"/>
+              </w:rPr>
+            </w:r>
+            <w:r>
+              <w:rPr>
+                <w:b/>
+                <w:sz w:val="19"/>
+              </w:rPr>
+              <w:t>Result</w:t>
+            </w:r>
+          </w:p>
+        </w:tc>
+      </w:tr>
+      <w:tr>
+        <w:tc>
+          <w:tcPr>
+            <w:tcW w:type="dxa" w:w="5040"/>
+          </w:tcPr>
+          <w:p>
+            <w:r>
+              <w:rPr>
+                <w:b w:val="0"/>
+                <w:sz w:val="19"/>
+              </w:rPr>
+            </w:r>
+            <w:r>
+              <w:rPr>
+                <w:b w:val="0"/>
+                <w:sz w:val="19"/>
+              </w:rPr>
+              <w:t xml:space="preserve">Baseline </w:t>
+            </w:r>
+            <w:r>
+              <w:rPr>
+                <w:rFonts w:ascii="Consolas" w:hAnsi="Consolas"/>
+                <w:b w:val="0"/>
+                <w:sz w:val="19"/>
+              </w:rPr>
+              <w:t>dotnet test</w:t>
+            </w:r>
+            <w:r>
+              <w:rPr>
+                <w:b w:val="0"/>
+                <w:sz w:val="19"/>
+              </w:rPr>
+              <w:t xml:space="preserve"> before patch</w:t>
+            </w:r>
+          </w:p>
+        </w:tc>
+        <w:tc>
+          <w:tcPr>
+            <w:tcW w:type="dxa" w:w="5040"/>
+          </w:tcPr>
+          <w:p>
+            <w:r>
+              <w:rPr>
+                <w:b w:val="0"/>
+                <w:sz w:val="19"/>
+              </w:rPr>
+            </w:r>
+            <w:r>
+              <w:rPr>
+                <w:b w:val="0"/>
+                <w:sz w:val="19"/>
+              </w:rPr>
+              <w:t>3 tests total, 1 failed, 2 passed</w:t>
+            </w:r>
+          </w:p>
+        </w:tc>
+      </w:tr>
+      <w:tr>
+        <w:tc>
+          <w:tcPr>
+            <w:tcW w:type="dxa" w:w="5040"/>
+          </w:tcPr>
+          <w:p>
+            <w:r>
+              <w:rPr>
+                <w:b w:val="0"/>
+                <w:sz w:val="19"/>
+              </w:rPr>
+            </w:r>
+            <w:r>
+              <w:rPr>
+                <w:b w:val="0"/>
+                <w:sz w:val="19"/>
+              </w:rPr>
+              <w:t>Baseline failure</w:t>
+            </w:r>
+          </w:p>
+        </w:tc>
+        <w:tc>
+          <w:tcPr>
+            <w:tcW w:type="dxa" w:w="5040"/>
+          </w:tcPr>
+          <w:p>
+            <w:r>
+              <w:rPr>
+                <w:b w:val="0"/>
+                <w:sz w:val="19"/>
+              </w:rPr>
+            </w:r>
+            <w:r>
+              <w:rPr>
+                <w:rFonts w:ascii="Consolas" w:hAnsi="Consolas"/>
+                <w:b w:val="0"/>
+                <w:sz w:val="19"/>
+              </w:rPr>
+              <w:t>MalformedScoreDoesNotCrash</w:t>
+            </w:r>
+            <w:r>
+              <w:rPr>
+                <w:b w:val="0"/>
+                <w:sz w:val="19"/>
+              </w:rPr>
+              <w:t xml:space="preserve"> failed with </w:t>
+            </w:r>
+            <w:r>
+              <w:rPr>
+                <w:rFonts w:ascii="Consolas" w:hAnsi="Consolas"/>
+                <w:b w:val="0"/>
+                <w:sz w:val="19"/>
+              </w:rPr>
+              <w:t>System.FormatException</w:t>
+            </w:r>
+          </w:p>
+        </w:tc>
+      </w:tr>
+      <w:tr>
+        <w:tc>
+          <w:tcPr>
+            <w:tcW w:type="dxa" w:w="5040"/>
+          </w:tcPr>
+          <w:p>
+            <w:r>
+              <w:rPr>
+                <w:b w:val="0"/>
+                <w:sz w:val="19"/>
+              </w:rPr>
+            </w:r>
+            <w:r>
+              <w:rPr>
+                <w:b w:val="0"/>
+                <w:sz w:val="19"/>
+              </w:rPr>
+              <w:t>Step 1 trace events</w:t>
+            </w:r>
+          </w:p>
+        </w:tc>
+        <w:tc>
+          <w:tcPr>
+            <w:tcW w:type="dxa" w:w="5040"/>
+          </w:tcPr>
+          <w:p>
+            <w:r>
+              <w:rPr>
+                <w:b w:val="0"/>
+                <w:sz w:val="19"/>
+              </w:rPr>
+            </w:r>
+            <w:r>
+              <w:rPr>
+                <w:b w:val="0"/>
+                <w:sz w:val="19"/>
+              </w:rPr>
+              <w:t>14 events</w:t>
+            </w:r>
+          </w:p>
+        </w:tc>
+      </w:tr>
+      <w:tr>
+        <w:tc>
+          <w:tcPr>
+            <w:tcW w:type="dxa" w:w="5040"/>
+          </w:tcPr>
+          <w:p>
+            <w:r>
+              <w:rPr>
+                <w:b w:val="0"/>
+                <w:sz w:val="19"/>
+              </w:rPr>
+            </w:r>
+            <w:r>
+              <w:rPr>
+                <w:b w:val="0"/>
+                <w:sz w:val="19"/>
+              </w:rPr>
+              <w:t>Step 2 violations after de-duplication fix</w:t>
+            </w:r>
+          </w:p>
+        </w:tc>
+        <w:tc>
+          <w:tcPr>
+            <w:tcW w:type="dxa" w:w="5040"/>
+          </w:tcPr>
+          <w:p>
+            <w:r>
+              <w:rPr>
+                <w:b w:val="0"/>
+                <w:sz w:val="19"/>
+              </w:rPr>
+            </w:r>
+            <w:r>
+              <w:rPr>
+                <w:b w:val="0"/>
+                <w:sz w:val="19"/>
+              </w:rPr>
+              <w:t xml:space="preserve">2 </w:t>
+            </w:r>
+            <w:r>
+              <w:rPr>
+                <w:rFonts w:ascii="Consolas" w:hAnsi="Consolas"/>
+                <w:b w:val="0"/>
+                <w:sz w:val="19"/>
+              </w:rPr>
+              <w:t>NoUnhandledException(event)</w:t>
+            </w:r>
+            <w:r>
+              <w:rPr>
+                <w:b w:val="0"/>
+                <w:sz w:val="19"/>
+              </w:rPr>
+              <w:t xml:space="preserve"> records</w:t>
+            </w:r>
+          </w:p>
+        </w:tc>
+      </w:tr>
+      <w:tr>
+        <w:tc>
+          <w:tcPr>
+            <w:tcW w:type="dxa" w:w="5040"/>
+          </w:tcPr>
+          <w:p>
+            <w:r>
+              <w:rPr>
+                <w:b w:val="0"/>
+                <w:sz w:val="19"/>
+              </w:rPr>
+            </w:r>
+            <w:r>
+              <w:rPr>
+                <w:b w:val="0"/>
+                <w:sz w:val="19"/>
+              </w:rPr>
+              <w:t>Step 3 classification</w:t>
+            </w:r>
+          </w:p>
+        </w:tc>
+        <w:tc>
+          <w:tcPr>
+            <w:tcW w:type="dxa" w:w="5040"/>
+          </w:tcPr>
+          <w:p>
+            <w:r>
+              <w:rPr>
+                <w:b w:val="0"/>
+                <w:sz w:val="19"/>
+              </w:rPr>
+            </w:r>
+            <w:r>
+              <w:rPr>
+                <w:b w:val="0"/>
+                <w:sz w:val="19"/>
+              </w:rPr>
+              <w:t xml:space="preserve">1 </w:t>
+            </w:r>
+            <w:r>
+              <w:rPr>
+                <w:rFonts w:ascii="Consolas" w:hAnsi="Consolas"/>
+                <w:b w:val="0"/>
+                <w:sz w:val="19"/>
+              </w:rPr>
+              <w:t>AutoPatchable</w:t>
+            </w:r>
+            <w:r>
+              <w:rPr>
+                <w:b w:val="0"/>
+                <w:sz w:val="19"/>
+              </w:rPr>
+              <w:t xml:space="preserve">, 1 </w:t>
+            </w:r>
+            <w:r>
+              <w:rPr>
+                <w:rFonts w:ascii="Consolas" w:hAnsi="Consolas"/>
+                <w:b w:val="0"/>
+                <w:sz w:val="19"/>
+              </w:rPr>
+              <w:t>IntentionalValidator</w:t>
+            </w:r>
+          </w:p>
+        </w:tc>
+      </w:tr>
+      <w:tr>
+        <w:tc>
+          <w:tcPr>
+            <w:tcW w:type="dxa" w:w="5040"/>
+          </w:tcPr>
+          <w:p>
+            <w:r>
+              <w:rPr>
+                <w:b w:val="0"/>
+                <w:sz w:val="19"/>
+              </w:rPr>
+            </w:r>
+            <w:r>
+              <w:rPr>
+                <w:b w:val="0"/>
+                <w:sz w:val="19"/>
+              </w:rPr>
+              <w:t>Generated patch</w:t>
+            </w:r>
+          </w:p>
+        </w:tc>
+        <w:tc>
+          <w:tcPr>
+            <w:tcW w:type="dxa" w:w="5040"/>
+          </w:tcPr>
+          <w:p>
+            <w:r>
+              <w:rPr>
+                <w:b w:val="0"/>
+                <w:sz w:val="19"/>
+              </w:rPr>
+            </w:r>
+            <w:r>
+              <w:rPr>
+                <w:rFonts w:ascii="Consolas" w:hAnsi="Consolas"/>
+                <w:b w:val="0"/>
+                <w:sz w:val="19"/>
+              </w:rPr>
+              <w:t>AutoRepair/fresh_validation_workspace/ScoreParserValidation/autorepair_reports/patches/ScoreParser.L7.diff</w:t>
+            </w:r>
+          </w:p>
+        </w:tc>
+      </w:tr>
+      <w:tr>
+        <w:tc>
+          <w:tcPr>
+            <w:tcW w:type="dxa" w:w="5040"/>
+          </w:tcPr>
+          <w:p>
+            <w:r>
+              <w:rPr>
+                <w:b w:val="0"/>
+                <w:sz w:val="19"/>
+              </w:rPr>
+            </w:r>
+            <w:r>
+              <w:rPr>
+                <w:b w:val="0"/>
+                <w:sz w:val="19"/>
+              </w:rPr>
+              <w:t>Test result after applying generated patch</w:t>
+            </w:r>
+          </w:p>
+        </w:tc>
+        <w:tc>
+          <w:tcPr>
+            <w:tcW w:type="dxa" w:w="5040"/>
+          </w:tcPr>
+          <w:p>
+            <w:r>
+              <w:rPr>
+                <w:b w:val="0"/>
+                <w:sz w:val="19"/>
+              </w:rPr>
+            </w:r>
+            <w:r>
+              <w:rPr>
+                <w:b w:val="0"/>
+                <w:sz w:val="19"/>
+              </w:rPr>
+              <w:t>3 tests total, 0 failed, 3 passed</w:t>
+            </w:r>
+          </w:p>
+        </w:tc>
+      </w:tr>
+      <w:tr>
+        <w:tc>
+          <w:tcPr>
+            <w:tcW w:type="dxa" w:w="5040"/>
+          </w:tcPr>
+          <w:p>
+            <w:r>
+              <w:rPr>
+                <w:b w:val="0"/>
+                <w:sz w:val="19"/>
+              </w:rPr>
+            </w:r>
+            <w:r>
+              <w:rPr>
+                <w:b w:val="0"/>
+                <w:sz w:val="19"/>
+              </w:rPr>
+              <w:t>Source state after verification</w:t>
+            </w:r>
+          </w:p>
+        </w:tc>
+        <w:tc>
+          <w:tcPr>
+            <w:tcW w:type="dxa" w:w="5040"/>
+          </w:tcPr>
+          <w:p>
+            <w:r>
+              <w:rPr>
+                <w:b w:val="0"/>
+                <w:sz w:val="19"/>
+              </w:rPr>
+            </w:r>
+            <w:r>
+              <w:rPr>
+                <w:b w:val="0"/>
+                <w:sz w:val="19"/>
+              </w:rPr>
+              <w:t xml:space="preserve">Original source restored; patch remains in </w:t>
+            </w:r>
+            <w:r>
+              <w:rPr>
+                <w:rFonts w:ascii="Consolas" w:hAnsi="Consolas"/>
+                <w:b w:val="0"/>
+                <w:sz w:val="19"/>
+              </w:rPr>
+              <w:t>autorepair_reports/patches</w:t>
+            </w:r>
+          </w:p>
+        </w:tc>
+      </w:tr>
+    </w:tbl>
+    <w:p/>
+    <w:p>
+      <w:r>
+        <w:t>Fresh patch snippet:</w:t>
+      </w:r>
+    </w:p>
+    <w:p>
+      <w:r>
+        <w:rPr>
+          <w:rFonts w:ascii="Consolas" w:hAnsi="Consolas"/>
+          <w:sz w:val="17"/>
+        </w:rPr>
+        <w:t>+        // [AutoRepair Step 3] Forward-propagated guard against System.FormatException</w:t>
+        <w:br/>
+        <w:t>+        try</w:t>
+        <w:br/>
+        <w:t>+        {</w:t>
+        <w:br/>
+        <w:t>+            if (row is null)</w:t>
+        <w:br/>
+        <w:t>+                throw new ArgumentNullException(nameof(row));</w:t>
+        <w:br/>
+        <w:t>+</w:t>
+        <w:br/>
+        <w:t>+            var parts = row.Split(',');</w:t>
+        <w:br/>
+        <w:t>+            return int.Parse(parts[1]);</w:t>
+        <w:br/>
+        <w:t>+        }</w:t>
+        <w:br/>
+        <w:t>+        catch (System.FormatException)</w:t>
+        <w:br/>
+        <w:t>+        {</w:t>
+        <w:br/>
+        <w:t>+            return default!;</w:t>
+        <w:br/>
+        <w:t>+        }</w:t>
+      </w:r>
+    </w:p>
+    <w:p>
+      <w:r>
+        <w:t>What this proves: on a new unscanned repo, the pipeline generated a concrete patch for the real crash, the patched repo's tests passed, and the intentional validator was not patched.</w:t>
+      </w:r>
+    </w:p>
+    <w:p>
+      <w:r>
+        <w:t>What this does not prove: it does not prove false positives are completely impossible in every C# repository. It proves that the known false-positive classes from Dimitrios' audit are handled in the benchmark, and that a fresh controlled repo now passes both the patch-generation and false-positive-control checks.</w:t>
       </w:r>
     </w:p>
     <w:p>
@@ -4879,7 +5795,40 @@
         <w:pStyle w:val="Heading2"/>
       </w:pPr>
       <w:r>
-        <w:t>3. Candidate patch compile checks</w:t>
+        <w:t>3. Fresh unseen repo patch/test validation</w:t>
+      </w:r>
+    </w:p>
+    <w:p>
+      <w:r>
+        <w:t>Fresh validation command sequence:</w:t>
+      </w:r>
+    </w:p>
+    <w:p>
+      <w:r>
+        <w:rPr>
+          <w:rFonts w:ascii="Consolas" w:hAnsi="Consolas"/>
+          <w:sz w:val="17"/>
+        </w:rPr>
+        <w:t>powershell -ExecutionPolicy Bypass -File AutoRepair\Step1_Tracing\generate_trace.ps1 -TargetSourceDir AutoRepair\fresh_validation_workspace\ScoreParserValidation\ScoreParser -TestProject AutoRepair\fresh_validation_workspace\ScoreParserValidation\ScoreParser.Tests\ScoreParser.Tests.csproj</w:t>
+        <w:br/>
+        <w:t>dotnet run --project AutoRepair\Step2_Constraints\Constraints\Constraints.csproj -- --trace AutoRepair\fresh_validation_workspace\ScoreParserValidation\autorepair_reports\trace_logs.jsonl --report AutoRepair\fresh_validation_workspace\ScoreParserValidation\autorepair_reports\violations.json</w:t>
+        <w:br/>
+        <w:t>dotnet run --project AutoRepair\Step3_Repair\CFGAnalyzer\CFGAnalyzer.csproj -- AutoRepair\fresh_validation_workspace\ScoreParserValidation\ScoreParser\ScoreParser.csproj --violations AutoRepair\fresh_validation_workspace\ScoreParserValidation\autorepair_reports\violations.json --output-dir AutoRepair\fresh_validation_workspace\ScoreParserValidation\autorepair_reports --apply-patches</w:t>
+        <w:br/>
+        <w:t>dotnet test AutoRepair\fresh_validation_workspace\ScoreParserValidation\ScoreParser.Tests\ScoreParser.Tests.csproj</w:t>
+      </w:r>
+    </w:p>
+    <w:p>
+      <w:r>
+        <w:t>Final result: the generated patch changed the fresh repo from 1 failing test to 3 / 3 passing tests. Step 3 restored the original source afterward, leaving the generated patch artifact for review.</w:t>
+      </w:r>
+    </w:p>
+    <w:p>
+      <w:pPr>
+        <w:pStyle w:val="Heading2"/>
+      </w:pPr>
+      <w:r>
+        <w:t>4. Candidate patch compile checks</w:t>
       </w:r>
     </w:p>
     <w:p>
@@ -5203,7 +6152,7 @@
     <w:p/>
     <w:p>
       <w:r>
-        <w:t>This validates that Step 3 emits buildable candidate patches. Full semantic correctness still requires a test oracle and domain review.</w:t>
+        <w:t>This validates that Step 3 emits buildable candidate patches. The fresh repo adds one test-oracle validation where the generated patch changed a failing test suite into a passing one. Full semantic correctness across arbitrary repositories still requires broader test oracles and domain review.</w:t>
       </w:r>
     </w:p>
     <w:p>
@@ -5795,7 +6744,7 @@
         <w:pStyle w:val="ListNumber"/>
       </w:pPr>
       <w:r>
-        <w:t>Start with the corrected result: 13 attempted, 10 traced, 239 violations, 6 generated candidate patches.</w:t>
+        <w:t>Start with the corrected result: 13 attempted, 10 traced, 296 violations, 6 generated candidate patches.</w:t>
       </w:r>
     </w:p>
     <w:p>
@@ -5837,7 +6786,33 @@
         <w:pStyle w:val="ListNumber"/>
       </w:pPr>
       <w:r>
-        <w:t>State that all six final candidates compile individually.</w:t>
+        <w:t xml:space="preserve">Show the fresh </w:t>
+      </w:r>
+      <w:r>
+        <w:rPr>
+          <w:rFonts w:ascii="Consolas" w:hAnsi="Consolas"/>
+          <w:sz w:val="18"/>
+        </w:rPr>
+        <w:t>ScoreParserValidation</w:t>
+      </w:r>
+      <w:r>
+        <w:t xml:space="preserve"> repo as the effective example: one real crash patched, one validator skipped, tests changed from 1 failing to 3 / 3 passing.</w:t>
+      </w:r>
+    </w:p>
+    <w:p>
+      <w:pPr>
+        <w:pStyle w:val="ListNumber"/>
+      </w:pPr>
+      <w:r>
+        <w:t>State that all six final benchmark candidates compile individually.</w:t>
+      </w:r>
+    </w:p>
+    <w:p>
+      <w:pPr>
+        <w:pStyle w:val="ListNumber"/>
+      </w:pPr>
+      <w:r>
+        <w:t>Be honest that false positives are reduced and tested against known cases, not mathematically eliminated for every possible repository.</w:t>
       </w:r>
     </w:p>
     <w:p>
@@ -6152,7 +7127,7 @@
                 <w:b w:val="0"/>
                 <w:sz w:val="19"/>
               </w:rPr>
-              <w:t>Step 1 logging fix</w:t>
+              <w:t>Fresh validation repo</w:t>
             </w:r>
           </w:p>
         </w:tc>
@@ -6173,7 +7148,7 @@
                 <w:b w:val="0"/>
                 <w:sz w:val="19"/>
               </w:rPr>
-              <w:t>AutoRepair/Step1_Tracing/Instrumenter/Rewriters/SafetyRewriter.cs</w:t>
+              <w:t>AutoRepair/fresh_validation_workspace/ScoreParserValidation</w:t>
             </w:r>
           </w:p>
         </w:tc>
@@ -6195,7 +7170,7 @@
                 <w:b w:val="0"/>
                 <w:sz w:val="19"/>
               </w:rPr>
-              <w:t>Step 2 cast fix</w:t>
+              <w:t>Fresh validation patch</w:t>
             </w:r>
           </w:p>
         </w:tc>
@@ -6216,7 +7191,7 @@
                 <w:b w:val="0"/>
                 <w:sz w:val="19"/>
               </w:rPr>
-              <w:t>AutoRepair/Step2_Constraints/Constraints/Rules/InvalidCastingRule.cs</w:t>
+              <w:t>AutoRepair/fresh_validation_workspace/ScoreParserValidation/autorepair_reports/patches/ScoreParser.L7.diff</w:t>
             </w:r>
           </w:p>
         </w:tc>
@@ -6238,7 +7213,7 @@
                 <w:b w:val="0"/>
                 <w:sz w:val="19"/>
               </w:rPr>
-              <w:t>Step 2 null tracking fix</w:t>
+              <w:t>Step 1 logging fix</w:t>
             </w:r>
           </w:p>
         </w:tc>
@@ -6259,7 +7234,7 @@
                 <w:b w:val="0"/>
                 <w:sz w:val="19"/>
               </w:rPr>
-              <w:t>AutoRepair/Step2_Constraints/Constraints/Runtime/StateTracker.cs</w:t>
+              <w:t>AutoRepair/Step1_Tracing/Instrumenter/Rewriters/SafetyRewriter.cs</w:t>
             </w:r>
           </w:p>
         </w:tc>
@@ -6281,7 +7256,7 @@
                 <w:b w:val="0"/>
                 <w:sz w:val="19"/>
               </w:rPr>
-              <w:t>Step 2 caller-handled exception filter</w:t>
+              <w:t>Step 2 cast fix</w:t>
             </w:r>
           </w:p>
         </w:tc>
@@ -6302,7 +7277,136 @@
                 <w:b w:val="0"/>
                 <w:sz w:val="19"/>
               </w:rPr>
+              <w:t>AutoRepair/Step2_Constraints/Constraints/Rules/InvalidCastingRule.cs</w:t>
+            </w:r>
+          </w:p>
+        </w:tc>
+      </w:tr>
+      <w:tr>
+        <w:tc>
+          <w:tcPr>
+            <w:tcW w:type="dxa" w:w="5040"/>
+          </w:tcPr>
+          <w:p>
+            <w:r>
+              <w:rPr>
+                <w:b w:val="0"/>
+                <w:sz w:val="19"/>
+              </w:rPr>
+            </w:r>
+            <w:r>
+              <w:rPr>
+                <w:b w:val="0"/>
+                <w:sz w:val="19"/>
+              </w:rPr>
+              <w:t>Step 2 null tracking fix</w:t>
+            </w:r>
+          </w:p>
+        </w:tc>
+        <w:tc>
+          <w:tcPr>
+            <w:tcW w:type="dxa" w:w="5040"/>
+          </w:tcPr>
+          <w:p>
+            <w:r>
+              <w:rPr>
+                <w:b w:val="0"/>
+                <w:sz w:val="19"/>
+              </w:rPr>
+            </w:r>
+            <w:r>
+              <w:rPr>
+                <w:rFonts w:ascii="Consolas" w:hAnsi="Consolas"/>
+                <w:b w:val="0"/>
+                <w:sz w:val="19"/>
+              </w:rPr>
+              <w:t>AutoRepair/Step2_Constraints/Constraints/Runtime/StateTracker.cs</w:t>
+            </w:r>
+          </w:p>
+        </w:tc>
+      </w:tr>
+      <w:tr>
+        <w:tc>
+          <w:tcPr>
+            <w:tcW w:type="dxa" w:w="5040"/>
+          </w:tcPr>
+          <w:p>
+            <w:r>
+              <w:rPr>
+                <w:b w:val="0"/>
+                <w:sz w:val="19"/>
+              </w:rPr>
+            </w:r>
+            <w:r>
+              <w:rPr>
+                <w:b w:val="0"/>
+                <w:sz w:val="19"/>
+              </w:rPr>
+              <w:t>Step 2 caller-handled exception filter</w:t>
+            </w:r>
+          </w:p>
+        </w:tc>
+        <w:tc>
+          <w:tcPr>
+            <w:tcW w:type="dxa" w:w="5040"/>
+          </w:tcPr>
+          <w:p>
+            <w:r>
+              <w:rPr>
+                <w:b w:val="0"/>
+                <w:sz w:val="19"/>
+              </w:rPr>
+            </w:r>
+            <w:r>
+              <w:rPr>
+                <w:rFonts w:ascii="Consolas" w:hAnsi="Consolas"/>
+                <w:b w:val="0"/>
+                <w:sz w:val="19"/>
+              </w:rPr>
               <w:t>AutoRepair/Step2_Constraints/Constraints/Program.cs</w:t>
+            </w:r>
+          </w:p>
+        </w:tc>
+      </w:tr>
+      <w:tr>
+        <w:tc>
+          <w:tcPr>
+            <w:tcW w:type="dxa" w:w="5040"/>
+          </w:tcPr>
+          <w:p>
+            <w:r>
+              <w:rPr>
+                <w:b w:val="0"/>
+                <w:sz w:val="19"/>
+              </w:rPr>
+            </w:r>
+            <w:r>
+              <w:rPr>
+                <w:b w:val="0"/>
+                <w:sz w:val="19"/>
+              </w:rPr>
+              <w:t>Step 2 exception de-duplication fix</w:t>
+            </w:r>
+          </w:p>
+        </w:tc>
+        <w:tc>
+          <w:tcPr>
+            <w:tcW w:type="dxa" w:w="5040"/>
+          </w:tcPr>
+          <w:p>
+            <w:r>
+              <w:rPr>
+                <w:b w:val="0"/>
+                <w:sz w:val="19"/>
+              </w:rPr>
+            </w:r>
+            <w:r>
+              <w:rPr>
+                <w:rFonts w:ascii="Consolas" w:hAnsi="Consolas"/>
+                <w:b w:val="0"/>
+                <w:sz w:val="19"/>
+              </w:rPr>
+              <w:t>AutoRepair/Step2_Constraints/Constraints/Rules/ExceptionRule.cs</w:t>
             </w:r>
           </w:p>
         </w:tc>

</xml_diff>